<commit_message>
Add Vanquish Capital Limited letterhead (parent company)
- Same brand system as VC Limited: Space Grotesk wordmark with orange
  square period, mono eyebrow, orange-square rule terminals
- Word template + blank print PDF for the Cork registered office
  (First Floor, Penrose 2, Penrose Dock, Cork T23 YY09, Ireland), with a
  'Registered in Ireland - Company No.' footer line left as a placeholder
- docx build script refactored to generate both companies from one config

Co-Authored-By: Claude Fable 5 <noreply@anthropic.com>
Claude-Session: https://claude.ai/code/session_018sf7RcgHrbFd4LukUbuGci
</commit_message>
<xml_diff>
--- a/letterhead/VC-Letterhead-A4.docx
+++ b/letterhead/VC-Letterhead-A4.docx
@@ -333,7 +333,7 @@
     <w:r>
       <w:drawing>
         <wp:inline distT="0" distB="0" distL="0" distR="0">
-          <wp:extent cx="20880000" cy="2991336"/>
+          <wp:extent cx="20856714" cy="2988000"/>
           <wp:effectExtent t="0" r="0" b="0" l="0"/>
           <wp:docPr id="1" name="" descr="" title=""/>
           <wp:cNvGraphicFramePr>
@@ -358,7 +358,7 @@
                 <pic:spPr bwMode="auto">
                   <a:xfrm>
                     <a:off x="0" y="0"/>
-                    <a:ext cx="20880000" cy="2991336"/>
+                    <a:ext cx="20856714" cy="2988000"/>
                   </a:xfrm>
                   <a:prstGeom prst="rect">
                     <a:avLst/>

</xml_diff>